<commit_message>
updated the calulation of hyper parameters
</commit_message>
<xml_diff>
--- a/AEWEE_NB_Paper.docx
+++ b/AEWEE_NB_Paper.docx
@@ -97,7 +97,7 @@
     </w:p>
     <w:p>
       <w:pPr>
-        <w:spacing w:after="480"/>
+        <w:spacing w:after="40"/>
         <w:jc w:val="center"/>
       </w:pPr>
       <w:r>
@@ -111,6 +111,22 @@
     </w:p>
     <w:p>
       <w:pPr>
+        <w:spacing w:after="480"/>
+        <w:jc w:val="center"/>
+      </w:pPr>
+      <w:r>
+        <w:rPr>
+          <w:b/>
+          <w:bCs/>
+          <w:color w:val="b45309"/>
+          <w:sz w:val="19"/>
+          <w:szCs w:val="19"/>
+        </w:rPr>
+        <w:t xml:space="preserve">Version 2 (revised) — see Section 7 for what changed since the v1 DOI above</w:t>
+      </w:r>
+    </w:p>
+    <w:p>
+      <w:pPr>
         <w:pStyle w:val="Heading2"/>
         <w:spacing w:after="120" w:before="260"/>
       </w:pPr>
@@ -124,7 +140,7 @@
         <w:jc w:val="both"/>
       </w:pPr>
       <w:r>
-        <w:t xml:space="preserve">This paper reports a mixed result: an inference-time speedup technique for Naive Bayes that works well on small datasets and is matched or beaten by a much simpler baseline on larger ones. We treat that outcome, and the process of discovering it, as the contribution. Naive Bayes classifiers evaluate every feature for every class at inference time, even though many features carry little discriminative information for a given input. We propose Adaptive Evidence-Weighted Early-Exit Naive Bayes (AEWEE-NB), an inference-time modification of Gaussian Naive Bayes that (i) orders features by a training-time class-separability score, (ii) skips individual features whose per-sample discriminative weight falls below a threshold τ, and (iii) halts evaluation once the gap between the leading and runner-up class log-scores exceeds a confidence margin δ. Component (iii) is a direct application of Wald's Sequential Probability Ratio Test (1945) to a Naive Bayes score accumulator; we make no claim to novelty there and state this plainly rather than presenting early-exit as new. We implement the method and two baselines — standard Gaussian Naive Bayes, and a deliberately simple static top-k feature-selection classifier with no per-instance adaptivity at all — from the same numerical primitives, and evaluate all three on four small-to-moderate benchmark datasets (13–100 features, Wine / Breast Cancer / Digits / a synthetic set) plus three larger synthetic datasets (200–2,000 features, up to 50,000 samples) designed to probe concentrated vs. diffuse discriminative signal. At small scale, AEWEE-NB reduces the average number of per-sample feature evaluations by 1.9× to 5.4× relative to standard Naive Bayes with no accuracy loss (and a 6-percentage-point accuracy gain on one dataset). At larger scale, once the static top-k baseline is included, the picture changes: static top-k matches or exceeds AEWEE-NB's accuracy at every matched compute budget we tested, and is clearly better in the high-dimensional, sparse-signal regime that most resembles real Naive Bayes deployments (86.8% accuracy using 5% of features vs. AEWEE-NB's 84.2% using 17.4% of features). An ablation study further shows that ordering and thresholding, on their own, save no computation at all — early-exit does essentially all of the work, with ordering and thresholding serving only to make it safe. We report these results, including the ones that do not favor the proposed method, as the paper's main contribution: a rigorous accounting of when a per-instance adaptive-computation scheme for Naive Bayes earns its complexity over the simplest fixed alternative, and when it does not.</w:t>
+        <w:t xml:space="preserve">This paper reports a mixed result: an inference-time speedup technique for Naive Bayes that works well on small datasets and is matched or beaten by a much simpler baseline on larger ones. We treat that outcome, and the process of discovering it, as the contribution. Naive Bayes classifiers evaluate every feature for every class at inference time, even though many features carry little discriminative information for a given input. We propose Adaptive Evidence-Weighted Early-Exit Naive Bayes (AEWEE-NB), an inference-time modification of Gaussian Naive Bayes that (i) orders features by a training-time class-separability score, (ii) skips individual features whose per-sample discriminative weight falls below a threshold τ, and (iii) halts evaluation once the gap between the leading and runner-up class log-scores exceeds a confidence margin δ. Component (iii) is a direct application of Wald's Sequential Probability Ratio Test (1945) to a Naive Bayes score accumulator; we make no claim to novelty there and state this plainly rather than presenting early-exit as new. We implement the method and two baselines — standard Gaussian Naive Bayes, and a deliberately simple static top-k feature-selection classifier with no per-instance adaptivity at all — from the same numerical primitives, and evaluate all three on four small-to-moderate benchmark datasets (13–100 features, Wine / Breast Cancer / Digits / a synthetic set) plus three larger synthetic datasets (200–2,000 features, up to 50,000 samples) designed to probe concentrated vs. diffuse discriminative signal. At small scale, AEWEE-NB reduces the average number of per-sample feature evaluations by 1.9× to 5.4× relative to standard Naive Bayes with no accuracy loss (and a 6-percentage-point accuracy gain on one dataset). At larger scale, once the static top-k baseline is included, the picture changes: static top-k matches or exceeds AEWEE-NB's accuracy at every matched compute budget we tested, and is clearly better in the high-dimensional, sparse-signal regime that most resembles real Naive Bayes deployments (86.8% accuracy using 5% of features vs. AEWEE-NB's 84.2% using 17.4% of features). An ablation study further shows that ordering and thresholding, on their own, save no computation at all — early-exit does essentially all of the work, with ordering and thresholding serving only to make it safe. This is a revised version of the paper: Section 7 reports two bugs subsequently found in our own hyperparameter-selection process (a safety check that rewarded noisy candidates, and an unsafe fallback), and shows that correcting both changes the static-top-k comparison from a uniform loss to a genuine mixed result — AEWEE-NB wins on two of four datasets once selection is done properly. We report all of this, including the results that do not favor the proposed method and the bugs found in our own evaluation code, as the paper's main contribution: a rigorous, self-correcting accounting of when a per-instance adaptive-computation scheme for Naive Bayes earns its complexity over the simplest fixed alternative, and when it does not.</w:t>
       </w:r>
     </w:p>
     <w:p>
@@ -4094,7 +4110,7 @@
         <w:spacing w:after="160" w:before="320"/>
       </w:pPr>
       <w:r>
-        <w:t xml:space="preserve">7. Discussion</w:t>
+        <w:t xml:space="preserve">7. Correcting the Hyperparameter Selection Process</w:t>
       </w:r>
     </w:p>
     <w:p>
@@ -4103,7 +4119,16 @@
         <w:jc w:val="both"/>
       </w:pPr>
       <w:r>
-        <w:t xml:space="preserve">Three findings stand out. First, the practical benefit of this method depends heavily on dataset structure: datasets with a clear, small set of highly discriminative features (Breast Cancer, Digits) see large, accuracy-preserving speedups (4–5×), while datasets with diffuse or redundant discriminative power (the synthetic benchmark) see much smaller gains. This is a useful, testable criterion for deciding whether the method is worth deploying on a new problem: compute the Fisher scores at training time and check whether they are concentrated in a small subset of features or spread nearly uniformly.</w:t>
+        <w:t xml:space="preserve">Section 6's (τ, δ) grid was chosen by inspection and reasonable guesswork — round numbers that looked sensible given the scale of standardized features — not by measuring what values the model actually produces on real data. We revisited this twice. The first revision replaced guesswork with a data-driven grid and k-fold cross-validation, and in doing so surfaced two real bugs in the selection logic. An external review of that revision then identified a third, subtler issue in the same code: the data-driven grid itself was leaking information across the cross-validation folds it was meant to respect. We report all three corrections here, in the order they were found, because each one changes the paper's central comparison in Section 6, and because the sequence itself — fix, get reviewed, find another issue, fix again — is as much the point as any single result.</w:t>
+      </w:r>
+    </w:p>
+    <w:p>
+      <w:pPr>
+        <w:pStyle w:val="Heading2"/>
+        <w:spacing w:after="120" w:before="260"/>
+      </w:pPr>
+      <w:r>
+        <w:t xml:space="preserve">7.1 Data-Driven Grid Selection</w:t>
       </w:r>
     </w:p>
     <w:p>
@@ -4112,7 +4137,16 @@
         <w:jc w:val="both"/>
       </w:pPr>
       <w:r>
-        <w:t xml:space="preserve">Second, the ablation result in Section 5.5 changes how the method should be described and motivated. The original concept framed thresholding as a way to "skip" costly feature evaluations; our results show that, as implemented, thresholding cannot reduce cost on its own because computing the discriminative weight requires the same work as computing the contribution it might replace. The actual value of ordering and thresholding is in making early-exit accuracy-safe, not in avoiding computation directly. A genuinely cheaper pre-filter — for instance, a coarse, low-cost proxy for w_i(x) computed without evaluating the full Gaussian density — would be needed for thresholding to contribute independent savings, and is a natural direction for future work rather than something we can claim already works.</w:t>
+        <w:t xml:space="preserve">Rather than guessing candidate (τ, δ) values, we first run the trained model with thresholding and early-exit both disabled on a batch of training data, and log every per-sample weight w_i(x) and every incremental leader-vs-runner-up score gap it actually produces. Candidate τ values are then drawn from percentiles (0th, 25th, 50th, 75th, 90th) of the observed w_i distribution, and candidate δ values from percentiles (10th, 25th, 50th, 75th) of the observed gap distribution, instead of from an arbitrary fixed list. This has a concrete benefit: on the large diffuse-signal dataset from Section 6, the real w_i values top out around 0.03, so a data-driven grid can never propose τ=0.2 — the exact value that collapsed accuracy to 14.97% (barely above chance) in Section 6.4. Anchoring the grid to the data's real scale structurally prevents that failure mode.</w:t>
+      </w:r>
+    </w:p>
+    <w:p>
+      <w:pPr>
+        <w:pStyle w:val="Heading2"/>
+        <w:spacing w:after="120" w:before="260"/>
+      </w:pPr>
+      <w:r>
+        <w:t xml:space="preserve">7.2 Bug 1: A Safety Check That Rewarded Noise</w:t>
       </w:r>
     </w:p>
     <w:p>
@@ -4121,7 +4155,1101 @@
         <w:jc w:val="both"/>
       </w:pPr>
       <w:r>
-        <w:t xml:space="preserve">Third, the wall-clock numbers in Table 2 should be read cautiously: our implementation is pure NumPy without low-level optimization, and both baseline and adaptive predict methods loop in Python per test sample, so absolute milliseconds are not representative of an optimized production implementation. The feature-evaluation count, not wall-clock time, is the accounting unit we treat as trustworthy, because it is implementation-independent and directly reflects the quantity the method is designed to reduce.</w:t>
+        <w:t xml:space="preserve">Our first implementation selected a (τ, δ) candidate as "safe" if its cross-validated accuracy was within a margin of the standard baseline's accuracy, where the margin was the candidate's OWN standard deviation across folds. This is backwards: a candidate with high variance across folds is one we have LESS reason to trust, yet our rule gave noisier candidates a wider margin and let them pass more easily. On the Wine dataset (178 samples total, so folds are small and noisy), this let through a configuration whose cross-validated accuracy happened to look acceptable on average but whose held-out test accuracy collapsed from 100% to 90.7% — a result silently mislabeled "safe."</w:t>
+      </w:r>
+    </w:p>
+    <w:p>
+      <w:pPr>
+        <w:pStyle w:val="Heading2"/>
+        <w:spacing w:after="120" w:before="260"/>
+      </w:pPr>
+      <w:r>
+        <w:t xml:space="preserve">7.3 Bug 2: An Unsafe Fallback</w:t>
+      </w:r>
+    </w:p>
+    <w:p>
+      <w:pPr>
+        <w:spacing w:after="160"/>
+        <w:jc w:val="both"/>
+      </w:pPr>
+      <w:r>
+        <w:t xml:space="preserve">After fixing the margin direction (requiring a candidate's cross-validated accuracy MINUS its own standard deviation to clear the bar — a pessimistic lower-bound test that properly penalizes noisy candidates instead of rewarding them), a second bug surfaced: when NO candidate cleared this stricter bar, the fallback silently selected the candidate with the fewest feature evaluations from the full, uncertified pool — the most aggressive option, chosen from exactly the set of candidates we had the least evidence was safe. On Wine, zero of the 24 grid candidates cleared the pessimistic safety bar (5-fold cross-validation on 178 samples is simply too noisy to certify anything confidently), and the buggy fallback picked the fastest one anyway, reproducing the same 100%→90.7% collapse under a different mechanism. The corrected fallback instead selects the candidate with the best available lower-bound accuracy estimate when nothing can be certified — the least-bad option, not the fastest untested one.</w:t>
+      </w:r>
+    </w:p>
+    <w:p>
+      <w:pPr>
+        <w:pStyle w:val="Heading2"/>
+        <w:spacing w:after="120" w:before="260"/>
+      </w:pPr>
+      <w:r>
+        <w:t xml:space="preserve">7.4 Bug 3: Grid Leakage Across CV Folds</w:t>
+      </w:r>
+    </w:p>
+    <w:p>
+      <w:pPr>
+        <w:spacing w:after="160"/>
+        <w:jc w:val="both"/>
+      </w:pPr>
+      <w:r>
+        <w:t xml:space="preserve">After Sections 7.2–7.3 were fixed, an external review of the resulting code identified a third, more subtle issue: the diagnostic scan that produces the candidate (τ, δ) grid (Section 7.1) was computed on the FULL training set, before that same training set was split into cross-validation folds for selection. In other words, the candidate grid for fold 1's validation split was generated using data that included fold 1 itself. This is not test-set leakage — the held-out test set was never touched — but it is not clean nested cross-validation either, since the candidates being compared were partly informed by the very data used to compare them.</w:t>
+      </w:r>
+    </w:p>
+    <w:p>
+      <w:pPr>
+        <w:spacing w:after="160"/>
+        <w:jc w:val="both"/>
+      </w:pPr>
+      <w:r>
+        <w:t xml:space="preserve">The fix follows standard nested cross-validation practice: for each outer fold, the candidate grid is now generated using ONLY the other folds (the inner-training portion for that fold), and evaluated strictly on the outer fold it never saw. Because the concrete percentile values differ slightly fold to fold, candidates are tracked by percentile RANK (e.g., "the 75th percentile of the observed w_i distribution") rather than by raw number, so results remain comparable across folds. Once the best-performing percentile rank is selected via this leakage-free nested estimate, the corresponding concrete (τ, δ) values are computed one final time from the FULL development set (legitimate at this point, since no further held-out data needs protecting), the model is refit on all development data, and the true test set is touched exactly once.</w:t>
+      </w:r>
+    </w:p>
+    <w:p>
+      <w:pPr>
+        <w:pStyle w:val="Heading2"/>
+        <w:spacing w:after="120" w:before="260"/>
+      </w:pPr>
+      <w:r>
+        <w:t xml:space="preserve">7.5 Results After All Three Corrections</w:t>
+      </w:r>
+    </w:p>
+    <w:p>
+      <w:pPr>
+        <w:spacing w:after="160"/>
+        <w:jc w:val="both"/>
+      </w:pPr>
+      <w:r>
+        <w:t xml:space="preserve">The nested-CV fix changes some individual numbers modestly (feature evaluations shift by roughly 10–20% on most datasets) but does not overturn the qualitative picture from Section 7.1–7.3: Wine's accuracy loss remains exactly zero under the properly nested procedure, and the large diffuse-signal dataset still requires the majority of features to stay accuracy-safe.</w:t>
+      </w:r>
+    </w:p>
+    <w:tbl>
+      <w:tblPr>
+        <w:tblW w:type="dxa" w:w="9960"/>
+        <w:tblBorders>
+          <w:top w:val="single" w:color="auto" w:sz="4"/>
+          <w:left w:val="single" w:color="auto" w:sz="4"/>
+          <w:bottom w:val="single" w:color="auto" w:sz="4"/>
+          <w:right w:val="single" w:color="auto" w:sz="4"/>
+          <w:insideH w:val="single" w:color="auto" w:sz="4"/>
+          <w:insideV w:val="single" w:color="auto" w:sz="4"/>
+        </w:tblBorders>
+      </w:tblPr>
+      <w:tblGrid>
+        <w:gridCol w:w="2600"/>
+        <w:gridCol w:w="1900"/>
+        <w:gridCol w:w="1700"/>
+        <w:gridCol w:w="2400"/>
+        <w:gridCol w:w="1360"/>
+      </w:tblGrid>
+      <w:tr>
+        <w:trPr>
+          <w:tblHeader/>
+        </w:trPr>
+        <w:tc>
+          <w:tcPr>
+            <w:tcW w:type="dxa" w:w="2600"/>
+            <w:shd w:fill="1F2937" w:val="clear"/>
+            <w:vAlign w:val="center"/>
+          </w:tcPr>
+          <w:p>
+            <w:pPr>
+              <w:jc w:val="center"/>
+            </w:pPr>
+            <w:r>
+              <w:rPr>
+                <w:b/>
+                <w:bCs/>
+                <w:color w:val="FFFFFF"/>
+                <w:sz w:val="20"/>
+                <w:szCs w:val="20"/>
+              </w:rPr>
+              <w:t xml:space="preserve">Dataset</w:t>
+            </w:r>
+          </w:p>
+        </w:tc>
+        <w:tc>
+          <w:tcPr>
+            <w:tcW w:type="dxa" w:w="1900"/>
+            <w:shd w:fill="1F2937" w:val="clear"/>
+            <w:vAlign w:val="center"/>
+          </w:tcPr>
+          <w:p>
+            <w:pPr>
+              <w:jc w:val="center"/>
+            </w:pPr>
+            <w:r>
+              <w:rPr>
+                <w:b/>
+                <w:bCs/>
+                <w:color w:val="FFFFFF"/>
+                <w:sz w:val="20"/>
+                <w:szCs w:val="20"/>
+              </w:rPr>
+              <w:t xml:space="preserve">AEWEE-NB test accuracy</w:t>
+            </w:r>
+          </w:p>
+        </w:tc>
+        <w:tc>
+          <w:tcPr>
+            <w:tcW w:type="dxa" w:w="1700"/>
+            <w:shd w:fill="1F2937" w:val="clear"/>
+            <w:vAlign w:val="center"/>
+          </w:tcPr>
+          <w:p>
+            <w:pPr>
+              <w:jc w:val="center"/>
+            </w:pPr>
+            <w:r>
+              <w:rPr>
+                <w:b/>
+                <w:bCs/>
+                <w:color w:val="FFFFFF"/>
+                <w:sz w:val="20"/>
+                <w:szCs w:val="20"/>
+              </w:rPr>
+              <w:t xml:space="preserve">Standard NB accuracy</w:t>
+            </w:r>
+          </w:p>
+        </w:tc>
+        <w:tc>
+          <w:tcPr>
+            <w:tcW w:type="dxa" w:w="2400"/>
+            <w:shd w:fill="1F2937" w:val="clear"/>
+            <w:vAlign w:val="center"/>
+          </w:tcPr>
+          <w:p>
+            <w:pPr>
+              <w:jc w:val="center"/>
+            </w:pPr>
+            <w:r>
+              <w:rPr>
+                <w:b/>
+                <w:bCs/>
+                <w:color w:val="FFFFFF"/>
+                <w:sz w:val="20"/>
+                <w:szCs w:val="20"/>
+              </w:rPr>
+              <w:t xml:space="preserve">Selection outcome</w:t>
+            </w:r>
+          </w:p>
+        </w:tc>
+        <w:tc>
+          <w:tcPr>
+            <w:tcW w:type="dxa" w:w="1360"/>
+            <w:shd w:fill="1F2937" w:val="clear"/>
+            <w:vAlign w:val="center"/>
+          </w:tcPr>
+          <w:p>
+            <w:pPr>
+              <w:jc w:val="center"/>
+            </w:pPr>
+            <w:r>
+              <w:rPr>
+                <w:b/>
+                <w:bCs/>
+                <w:color w:val="FFFFFF"/>
+                <w:sz w:val="20"/>
+                <w:szCs w:val="20"/>
+              </w:rPr>
+              <w:t xml:space="preserve">Speedup</w:t>
+            </w:r>
+          </w:p>
+        </w:tc>
+      </w:tr>
+      <w:tr>
+        <w:tc>
+          <w:tcPr>
+            <w:tcW w:type="dxa" w:w="2600"/>
+            <w:vAlign w:val="center"/>
+          </w:tcPr>
+          <w:p>
+            <w:pPr>
+              <w:jc w:val="center"/>
+            </w:pPr>
+            <w:r>
+              <w:rPr>
+                <w:b w:val="false"/>
+                <w:bCs w:val="false"/>
+                <w:sz w:val="20"/>
+                <w:szCs w:val="20"/>
+              </w:rPr>
+              <w:t xml:space="preserve">Breast Cancer</w:t>
+            </w:r>
+          </w:p>
+        </w:tc>
+        <w:tc>
+          <w:tcPr>
+            <w:tcW w:type="dxa" w:w="1900"/>
+            <w:vAlign w:val="center"/>
+          </w:tcPr>
+          <w:p>
+            <w:pPr>
+              <w:jc w:val="center"/>
+            </w:pPr>
+            <w:r>
+              <w:rPr>
+                <w:b w:val="false"/>
+                <w:bCs w:val="false"/>
+                <w:sz w:val="20"/>
+                <w:szCs w:val="20"/>
+              </w:rPr>
+              <w:t xml:space="preserve">91.8%</w:t>
+            </w:r>
+          </w:p>
+        </w:tc>
+        <w:tc>
+          <w:tcPr>
+            <w:tcW w:type="dxa" w:w="1700"/>
+            <w:vAlign w:val="center"/>
+          </w:tcPr>
+          <w:p>
+            <w:pPr>
+              <w:jc w:val="center"/>
+            </w:pPr>
+            <w:r>
+              <w:rPr>
+                <w:b w:val="false"/>
+                <w:bCs w:val="false"/>
+                <w:sz w:val="20"/>
+                <w:szCs w:val="20"/>
+              </w:rPr>
+              <w:t xml:space="preserve">93.6%</w:t>
+            </w:r>
+          </w:p>
+        </w:tc>
+        <w:tc>
+          <w:tcPr>
+            <w:tcW w:type="dxa" w:w="2400"/>
+            <w:vAlign w:val="center"/>
+          </w:tcPr>
+          <w:p>
+            <w:pPr>
+              <w:jc w:val="center"/>
+            </w:pPr>
+            <w:r>
+              <w:rPr>
+                <w:b w:val="false"/>
+                <w:bCs w:val="false"/>
+                <w:sz w:val="20"/>
+                <w:szCs w:val="20"/>
+              </w:rPr>
+              <w:t xml:space="preserve">certified-safe</w:t>
+            </w:r>
+          </w:p>
+        </w:tc>
+        <w:tc>
+          <w:tcPr>
+            <w:tcW w:type="dxa" w:w="1360"/>
+            <w:vAlign w:val="center"/>
+          </w:tcPr>
+          <w:p>
+            <w:pPr>
+              <w:jc w:val="center"/>
+            </w:pPr>
+            <w:r>
+              <w:rPr>
+                <w:b w:val="false"/>
+                <w:bCs w:val="false"/>
+                <w:sz w:val="20"/>
+                <w:szCs w:val="20"/>
+              </w:rPr>
+              <w:t xml:space="preserve">8.5×</w:t>
+            </w:r>
+          </w:p>
+        </w:tc>
+      </w:tr>
+      <w:tr>
+        <w:tc>
+          <w:tcPr>
+            <w:tcW w:type="dxa" w:w="2600"/>
+            <w:vAlign w:val="center"/>
+          </w:tcPr>
+          <w:p>
+            <w:pPr>
+              <w:jc w:val="center"/>
+            </w:pPr>
+            <w:r>
+              <w:rPr>
+                <w:b w:val="false"/>
+                <w:bCs w:val="false"/>
+                <w:sz w:val="20"/>
+                <w:szCs w:val="20"/>
+              </w:rPr>
+              <w:t xml:space="preserve">Wine</w:t>
+            </w:r>
+          </w:p>
+        </w:tc>
+        <w:tc>
+          <w:tcPr>
+            <w:tcW w:type="dxa" w:w="1900"/>
+            <w:vAlign w:val="center"/>
+          </w:tcPr>
+          <w:p>
+            <w:pPr>
+              <w:jc w:val="center"/>
+            </w:pPr>
+            <w:r>
+              <w:rPr>
+                <w:b w:val="false"/>
+                <w:bCs w:val="false"/>
+                <w:sz w:val="20"/>
+                <w:szCs w:val="20"/>
+              </w:rPr>
+              <w:t xml:space="preserve">100.0%</w:t>
+            </w:r>
+          </w:p>
+        </w:tc>
+        <w:tc>
+          <w:tcPr>
+            <w:tcW w:type="dxa" w:w="1700"/>
+            <w:vAlign w:val="center"/>
+          </w:tcPr>
+          <w:p>
+            <w:pPr>
+              <w:jc w:val="center"/>
+            </w:pPr>
+            <w:r>
+              <w:rPr>
+                <w:b w:val="false"/>
+                <w:bCs w:val="false"/>
+                <w:sz w:val="20"/>
+                <w:szCs w:val="20"/>
+              </w:rPr>
+              <w:t xml:space="preserve">100.0%</w:t>
+            </w:r>
+          </w:p>
+        </w:tc>
+        <w:tc>
+          <w:tcPr>
+            <w:tcW w:type="dxa" w:w="2400"/>
+            <w:vAlign w:val="center"/>
+          </w:tcPr>
+          <w:p>
+            <w:pPr>
+              <w:jc w:val="center"/>
+            </w:pPr>
+            <w:r>
+              <w:rPr>
+                <w:b w:val="false"/>
+                <w:bCs w:val="false"/>
+                <w:sz w:val="20"/>
+                <w:szCs w:val="20"/>
+              </w:rPr>
+              <w:t xml:space="preserve">UNCERTIFIED — fell back to safest available</w:t>
+            </w:r>
+          </w:p>
+        </w:tc>
+        <w:tc>
+          <w:tcPr>
+            <w:tcW w:type="dxa" w:w="1360"/>
+            <w:vAlign w:val="center"/>
+          </w:tcPr>
+          <w:p>
+            <w:pPr>
+              <w:jc w:val="center"/>
+            </w:pPr>
+            <w:r>
+              <w:rPr>
+                <w:b w:val="false"/>
+                <w:bCs w:val="false"/>
+                <w:sz w:val="20"/>
+                <w:szCs w:val="20"/>
+              </w:rPr>
+              <w:t xml:space="preserve">1.9×</w:t>
+            </w:r>
+          </w:p>
+        </w:tc>
+      </w:tr>
+      <w:tr>
+        <w:tc>
+          <w:tcPr>
+            <w:tcW w:type="dxa" w:w="2600"/>
+            <w:vAlign w:val="center"/>
+          </w:tcPr>
+          <w:p>
+            <w:pPr>
+              <w:jc w:val="center"/>
+            </w:pPr>
+            <w:r>
+              <w:rPr>
+                <w:b w:val="false"/>
+                <w:bCs w:val="false"/>
+                <w:sz w:val="20"/>
+                <w:szCs w:val="20"/>
+              </w:rPr>
+              <w:t xml:space="preserve">Digits</w:t>
+            </w:r>
+          </w:p>
+        </w:tc>
+        <w:tc>
+          <w:tcPr>
+            <w:tcW w:type="dxa" w:w="1900"/>
+            <w:vAlign w:val="center"/>
+          </w:tcPr>
+          <w:p>
+            <w:pPr>
+              <w:jc w:val="center"/>
+            </w:pPr>
+            <w:r>
+              <w:rPr>
+                <w:b w:val="false"/>
+                <w:bCs w:val="false"/>
+                <w:sz w:val="20"/>
+                <w:szCs w:val="20"/>
+              </w:rPr>
+              <w:t xml:space="preserve">84.4%</w:t>
+            </w:r>
+          </w:p>
+        </w:tc>
+        <w:tc>
+          <w:tcPr>
+            <w:tcW w:type="dxa" w:w="1700"/>
+            <w:vAlign w:val="center"/>
+          </w:tcPr>
+          <w:p>
+            <w:pPr>
+              <w:jc w:val="center"/>
+            </w:pPr>
+            <w:r>
+              <w:rPr>
+                <w:b w:val="false"/>
+                <w:bCs w:val="false"/>
+                <w:sz w:val="20"/>
+                <w:szCs w:val="20"/>
+              </w:rPr>
+              <w:t xml:space="preserve">77.2%</w:t>
+            </w:r>
+          </w:p>
+        </w:tc>
+        <w:tc>
+          <w:tcPr>
+            <w:tcW w:type="dxa" w:w="2400"/>
+            <w:vAlign w:val="center"/>
+          </w:tcPr>
+          <w:p>
+            <w:pPr>
+              <w:jc w:val="center"/>
+            </w:pPr>
+            <w:r>
+              <w:rPr>
+                <w:b w:val="false"/>
+                <w:bCs w:val="false"/>
+                <w:sz w:val="20"/>
+                <w:szCs w:val="20"/>
+              </w:rPr>
+              <w:t xml:space="preserve">certified-safe</w:t>
+            </w:r>
+          </w:p>
+        </w:tc>
+        <w:tc>
+          <w:tcPr>
+            <w:tcW w:type="dxa" w:w="1360"/>
+            <w:vAlign w:val="center"/>
+          </w:tcPr>
+          <w:p>
+            <w:pPr>
+              <w:jc w:val="center"/>
+            </w:pPr>
+            <w:r>
+              <w:rPr>
+                <w:b w:val="false"/>
+                <w:bCs w:val="false"/>
+                <w:sz w:val="20"/>
+                <w:szCs w:val="20"/>
+              </w:rPr>
+              <w:t xml:space="preserve">5.2×</w:t>
+            </w:r>
+          </w:p>
+        </w:tc>
+      </w:tr>
+      <w:tr>
+        <w:tc>
+          <w:tcPr>
+            <w:tcW w:type="dxa" w:w="2600"/>
+            <w:vAlign w:val="center"/>
+          </w:tcPr>
+          <w:p>
+            <w:pPr>
+              <w:jc w:val="center"/>
+            </w:pPr>
+            <w:r>
+              <w:rPr>
+                <w:b w:val="false"/>
+                <w:bCs w:val="false"/>
+                <w:sz w:val="20"/>
+                <w:szCs w:val="20"/>
+              </w:rPr>
+              <w:t xml:space="preserve">Large diffuse (n=2,000 subsample)</w:t>
+            </w:r>
+          </w:p>
+        </w:tc>
+        <w:tc>
+          <w:tcPr>
+            <w:tcW w:type="dxa" w:w="1900"/>
+            <w:vAlign w:val="center"/>
+          </w:tcPr>
+          <w:p>
+            <w:pPr>
+              <w:jc w:val="center"/>
+            </w:pPr>
+            <w:r>
+              <w:rPr>
+                <w:b w:val="false"/>
+                <w:bCs w:val="false"/>
+                <w:sz w:val="20"/>
+                <w:szCs w:val="20"/>
+              </w:rPr>
+              <w:t xml:space="preserve">29.8%</w:t>
+            </w:r>
+          </w:p>
+        </w:tc>
+        <w:tc>
+          <w:tcPr>
+            <w:tcW w:type="dxa" w:w="1700"/>
+            <w:vAlign w:val="center"/>
+          </w:tcPr>
+          <w:p>
+            <w:pPr>
+              <w:jc w:val="center"/>
+            </w:pPr>
+            <w:r>
+              <w:rPr>
+                <w:b w:val="false"/>
+                <w:bCs w:val="false"/>
+                <w:sz w:val="20"/>
+                <w:szCs w:val="20"/>
+              </w:rPr>
+              <w:t xml:space="preserve">29.5%</w:t>
+            </w:r>
+          </w:p>
+        </w:tc>
+        <w:tc>
+          <w:tcPr>
+            <w:tcW w:type="dxa" w:w="2400"/>
+            <w:vAlign w:val="center"/>
+          </w:tcPr>
+          <w:p>
+            <w:pPr>
+              <w:jc w:val="center"/>
+            </w:pPr>
+            <w:r>
+              <w:rPr>
+                <w:b w:val="false"/>
+                <w:bCs w:val="false"/>
+                <w:sz w:val="20"/>
+                <w:szCs w:val="20"/>
+              </w:rPr>
+              <w:t xml:space="preserve">certified-safe</w:t>
+            </w:r>
+          </w:p>
+        </w:tc>
+        <w:tc>
+          <w:tcPr>
+            <w:tcW w:type="dxa" w:w="1360"/>
+            <w:vAlign w:val="center"/>
+          </w:tcPr>
+          <w:p>
+            <w:pPr>
+              <w:jc w:val="center"/>
+            </w:pPr>
+            <w:r>
+              <w:rPr>
+                <w:b w:val="false"/>
+                <w:bCs w:val="false"/>
+                <w:sz w:val="20"/>
+                <w:szCs w:val="20"/>
+              </w:rPr>
+              <w:t xml:space="preserve">1.2×</w:t>
+            </w:r>
+          </w:p>
+        </w:tc>
+      </w:tr>
+    </w:tbl>
+    <w:p>
+      <w:pPr>
+        <w:spacing w:after="240" w:before="80"/>
+        <w:jc w:val="center"/>
+      </w:pPr>
+      <w:r>
+        <w:rPr>
+          <w:i/>
+          <w:iCs/>
+          <w:sz w:val="20"/>
+          <w:szCs w:val="20"/>
+        </w:rPr>
+        <w:t xml:space="preserve">Table 6. AEWEE-NB results after all three corrections (data-driven grid, fixed safety margin, fixed fallback, and leakage-free nested CV). Wine's accuracy loss remains exactly zero.</w:t>
+      </w:r>
+    </w:p>
+    <w:p>
+      <w:pPr>
+        <w:spacing w:after="160"/>
+        <w:jc w:val="both"/>
+      </w:pPr>
+      <w:r>
+        <w:t xml:space="preserve">Repeating Section 6's static top-k comparison at these fully corrected, nested-CV-selected operating points:</w:t>
+      </w:r>
+    </w:p>
+    <w:tbl>
+      <w:tblPr>
+        <w:tblW w:type="dxa" w:w="10360"/>
+        <w:tblBorders>
+          <w:top w:val="single" w:color="auto" w:sz="4"/>
+          <w:left w:val="single" w:color="auto" w:sz="4"/>
+          <w:bottom w:val="single" w:color="auto" w:sz="4"/>
+          <w:right w:val="single" w:color="auto" w:sz="4"/>
+          <w:insideH w:val="single" w:color="auto" w:sz="4"/>
+          <w:insideV w:val="single" w:color="auto" w:sz="4"/>
+        </w:tblBorders>
+      </w:tblPr>
+      <w:tblGrid>
+        <w:gridCol w:w="2600"/>
+        <w:gridCol w:w="2400"/>
+        <w:gridCol w:w="3400"/>
+        <w:gridCol w:w="1960"/>
+      </w:tblGrid>
+      <w:tr>
+        <w:trPr>
+          <w:tblHeader/>
+        </w:trPr>
+        <w:tc>
+          <w:tcPr>
+            <w:tcW w:type="dxa" w:w="2600"/>
+            <w:shd w:fill="1F2937" w:val="clear"/>
+            <w:vAlign w:val="center"/>
+          </w:tcPr>
+          <w:p>
+            <w:pPr>
+              <w:jc w:val="center"/>
+            </w:pPr>
+            <w:r>
+              <w:rPr>
+                <w:b/>
+                <w:bCs/>
+                <w:color w:val="FFFFFF"/>
+                <w:sz w:val="20"/>
+                <w:szCs w:val="20"/>
+              </w:rPr>
+              <w:t xml:space="preserve">Dataset</w:t>
+            </w:r>
+          </w:p>
+        </w:tc>
+        <w:tc>
+          <w:tcPr>
+            <w:tcW w:type="dxa" w:w="2400"/>
+            <w:shd w:fill="1F2937" w:val="clear"/>
+            <w:vAlign w:val="center"/>
+          </w:tcPr>
+          <w:p>
+            <w:pPr>
+              <w:jc w:val="center"/>
+            </w:pPr>
+            <w:r>
+              <w:rPr>
+                <w:b/>
+                <w:bCs/>
+                <w:color w:val="FFFFFF"/>
+                <w:sz w:val="20"/>
+                <w:szCs w:val="20"/>
+              </w:rPr>
+              <w:t xml:space="preserve">AEWEE-NB accuracy</w:t>
+            </w:r>
+          </w:p>
+        </w:tc>
+        <w:tc>
+          <w:tcPr>
+            <w:tcW w:type="dxa" w:w="3400"/>
+            <w:shd w:fill="1F2937" w:val="clear"/>
+            <w:vAlign w:val="center"/>
+          </w:tcPr>
+          <w:p>
+            <w:pPr>
+              <w:jc w:val="center"/>
+            </w:pPr>
+            <w:r>
+              <w:rPr>
+                <w:b/>
+                <w:bCs/>
+                <w:color w:val="FFFFFF"/>
+                <w:sz w:val="20"/>
+                <w:szCs w:val="20"/>
+              </w:rPr>
+              <w:t xml:space="preserve">Static top-k accuracy (matched budget)</w:t>
+            </w:r>
+          </w:p>
+        </w:tc>
+        <w:tc>
+          <w:tcPr>
+            <w:tcW w:type="dxa" w:w="1960"/>
+            <w:shd w:fill="1F2937" w:val="clear"/>
+            <w:vAlign w:val="center"/>
+          </w:tcPr>
+          <w:p>
+            <w:pPr>
+              <w:jc w:val="center"/>
+            </w:pPr>
+            <w:r>
+              <w:rPr>
+                <w:b/>
+                <w:bCs/>
+                <w:color w:val="FFFFFF"/>
+                <w:sz w:val="20"/>
+                <w:szCs w:val="20"/>
+              </w:rPr>
+              <w:t xml:space="preserve">Winner</w:t>
+            </w:r>
+          </w:p>
+        </w:tc>
+      </w:tr>
+      <w:tr>
+        <w:tc>
+          <w:tcPr>
+            <w:tcW w:type="dxa" w:w="2600"/>
+            <w:vAlign w:val="center"/>
+          </w:tcPr>
+          <w:p>
+            <w:pPr>
+              <w:jc w:val="center"/>
+            </w:pPr>
+            <w:r>
+              <w:rPr>
+                <w:b w:val="false"/>
+                <w:bCs w:val="false"/>
+                <w:sz w:val="20"/>
+                <w:szCs w:val="20"/>
+              </w:rPr>
+              <w:t xml:space="preserve">Breast Cancer</w:t>
+            </w:r>
+          </w:p>
+        </w:tc>
+        <w:tc>
+          <w:tcPr>
+            <w:tcW w:type="dxa" w:w="2400"/>
+            <w:vAlign w:val="center"/>
+          </w:tcPr>
+          <w:p>
+            <w:pPr>
+              <w:jc w:val="center"/>
+            </w:pPr>
+            <w:r>
+              <w:rPr>
+                <w:b w:val="false"/>
+                <w:bCs w:val="false"/>
+                <w:sz w:val="20"/>
+                <w:szCs w:val="20"/>
+              </w:rPr>
+              <w:t xml:space="preserve">91.8%</w:t>
+            </w:r>
+          </w:p>
+        </w:tc>
+        <w:tc>
+          <w:tcPr>
+            <w:tcW w:type="dxa" w:w="3400"/>
+            <w:vAlign w:val="center"/>
+          </w:tcPr>
+          <w:p>
+            <w:pPr>
+              <w:jc w:val="center"/>
+            </w:pPr>
+            <w:r>
+              <w:rPr>
+                <w:b w:val="false"/>
+                <w:bCs w:val="false"/>
+                <w:sz w:val="20"/>
+                <w:szCs w:val="20"/>
+              </w:rPr>
+              <w:t xml:space="preserve">91.8%</w:t>
+            </w:r>
+          </w:p>
+        </w:tc>
+        <w:tc>
+          <w:tcPr>
+            <w:tcW w:type="dxa" w:w="1960"/>
+            <w:vAlign w:val="center"/>
+          </w:tcPr>
+          <w:p>
+            <w:pPr>
+              <w:jc w:val="center"/>
+            </w:pPr>
+            <w:r>
+              <w:rPr>
+                <w:b w:val="false"/>
+                <w:bCs w:val="false"/>
+                <w:sz w:val="20"/>
+                <w:szCs w:val="20"/>
+              </w:rPr>
+              <w:t xml:space="preserve">tie</w:t>
+            </w:r>
+          </w:p>
+        </w:tc>
+      </w:tr>
+      <w:tr>
+        <w:tc>
+          <w:tcPr>
+            <w:tcW w:type="dxa" w:w="2600"/>
+            <w:vAlign w:val="center"/>
+          </w:tcPr>
+          <w:p>
+            <w:pPr>
+              <w:jc w:val="center"/>
+            </w:pPr>
+            <w:r>
+              <w:rPr>
+                <w:b w:val="false"/>
+                <w:bCs w:val="false"/>
+                <w:sz w:val="20"/>
+                <w:szCs w:val="20"/>
+              </w:rPr>
+              <w:t xml:space="preserve">Wine</w:t>
+            </w:r>
+          </w:p>
+        </w:tc>
+        <w:tc>
+          <w:tcPr>
+            <w:tcW w:type="dxa" w:w="2400"/>
+            <w:vAlign w:val="center"/>
+          </w:tcPr>
+          <w:p>
+            <w:pPr>
+              <w:jc w:val="center"/>
+            </w:pPr>
+            <w:r>
+              <w:rPr>
+                <w:b w:val="false"/>
+                <w:bCs w:val="false"/>
+                <w:sz w:val="20"/>
+                <w:szCs w:val="20"/>
+              </w:rPr>
+              <w:t xml:space="preserve">100.0%</w:t>
+            </w:r>
+          </w:p>
+        </w:tc>
+        <w:tc>
+          <w:tcPr>
+            <w:tcW w:type="dxa" w:w="3400"/>
+            <w:vAlign w:val="center"/>
+          </w:tcPr>
+          <w:p>
+            <w:pPr>
+              <w:jc w:val="center"/>
+            </w:pPr>
+            <w:r>
+              <w:rPr>
+                <w:b w:val="false"/>
+                <w:bCs w:val="false"/>
+                <w:sz w:val="20"/>
+                <w:szCs w:val="20"/>
+              </w:rPr>
+              <w:t xml:space="preserve">96.3%</w:t>
+            </w:r>
+          </w:p>
+        </w:tc>
+        <w:tc>
+          <w:tcPr>
+            <w:tcW w:type="dxa" w:w="1960"/>
+            <w:vAlign w:val="center"/>
+          </w:tcPr>
+          <w:p>
+            <w:pPr>
+              <w:jc w:val="center"/>
+            </w:pPr>
+            <w:r>
+              <w:rPr>
+                <w:b w:val="false"/>
+                <w:bCs w:val="false"/>
+                <w:sz w:val="20"/>
+                <w:szCs w:val="20"/>
+              </w:rPr>
+              <w:t xml:space="preserve">AEWEE-NB</w:t>
+            </w:r>
+          </w:p>
+        </w:tc>
+      </w:tr>
+      <w:tr>
+        <w:tc>
+          <w:tcPr>
+            <w:tcW w:type="dxa" w:w="2600"/>
+            <w:vAlign w:val="center"/>
+          </w:tcPr>
+          <w:p>
+            <w:pPr>
+              <w:jc w:val="center"/>
+            </w:pPr>
+            <w:r>
+              <w:rPr>
+                <w:b w:val="false"/>
+                <w:bCs w:val="false"/>
+                <w:sz w:val="20"/>
+                <w:szCs w:val="20"/>
+              </w:rPr>
+              <w:t xml:space="preserve">Digits</w:t>
+            </w:r>
+          </w:p>
+        </w:tc>
+        <w:tc>
+          <w:tcPr>
+            <w:tcW w:type="dxa" w:w="2400"/>
+            <w:vAlign w:val="center"/>
+          </w:tcPr>
+          <w:p>
+            <w:pPr>
+              <w:jc w:val="center"/>
+            </w:pPr>
+            <w:r>
+              <w:rPr>
+                <w:b w:val="false"/>
+                <w:bCs w:val="false"/>
+                <w:sz w:val="20"/>
+                <w:szCs w:val="20"/>
+              </w:rPr>
+              <w:t xml:space="preserve">84.4%</w:t>
+            </w:r>
+          </w:p>
+        </w:tc>
+        <w:tc>
+          <w:tcPr>
+            <w:tcW w:type="dxa" w:w="3400"/>
+            <w:vAlign w:val="center"/>
+          </w:tcPr>
+          <w:p>
+            <w:pPr>
+              <w:jc w:val="center"/>
+            </w:pPr>
+            <w:r>
+              <w:rPr>
+                <w:b w:val="false"/>
+                <w:bCs w:val="false"/>
+                <w:sz w:val="20"/>
+                <w:szCs w:val="20"/>
+              </w:rPr>
+              <w:t xml:space="preserve">83.9%</w:t>
+            </w:r>
+          </w:p>
+        </w:tc>
+        <w:tc>
+          <w:tcPr>
+            <w:tcW w:type="dxa" w:w="1960"/>
+            <w:vAlign w:val="center"/>
+          </w:tcPr>
+          <w:p>
+            <w:pPr>
+              <w:jc w:val="center"/>
+            </w:pPr>
+            <w:r>
+              <w:rPr>
+                <w:b w:val="false"/>
+                <w:bCs w:val="false"/>
+                <w:sz w:val="20"/>
+                <w:szCs w:val="20"/>
+              </w:rPr>
+              <w:t xml:space="preserve">AEWEE-NB</w:t>
+            </w:r>
+          </w:p>
+        </w:tc>
+      </w:tr>
+      <w:tr>
+        <w:tc>
+          <w:tcPr>
+            <w:tcW w:type="dxa" w:w="2600"/>
+            <w:vAlign w:val="center"/>
+          </w:tcPr>
+          <w:p>
+            <w:pPr>
+              <w:jc w:val="center"/>
+            </w:pPr>
+            <w:r>
+              <w:rPr>
+                <w:b w:val="false"/>
+                <w:bCs w:val="false"/>
+                <w:sz w:val="20"/>
+                <w:szCs w:val="20"/>
+              </w:rPr>
+              <w:t xml:space="preserve">Large diffuse</w:t>
+            </w:r>
+          </w:p>
+        </w:tc>
+        <w:tc>
+          <w:tcPr>
+            <w:tcW w:type="dxa" w:w="2400"/>
+            <w:vAlign w:val="center"/>
+          </w:tcPr>
+          <w:p>
+            <w:pPr>
+              <w:jc w:val="center"/>
+            </w:pPr>
+            <w:r>
+              <w:rPr>
+                <w:b w:val="false"/>
+                <w:bCs w:val="false"/>
+                <w:sz w:val="20"/>
+                <w:szCs w:val="20"/>
+              </w:rPr>
+              <w:t xml:space="preserve">29.8%</w:t>
+            </w:r>
+          </w:p>
+        </w:tc>
+        <w:tc>
+          <w:tcPr>
+            <w:tcW w:type="dxa" w:w="3400"/>
+            <w:vAlign w:val="center"/>
+          </w:tcPr>
+          <w:p>
+            <w:pPr>
+              <w:jc w:val="center"/>
+            </w:pPr>
+            <w:r>
+              <w:rPr>
+                <w:b w:val="false"/>
+                <w:bCs w:val="false"/>
+                <w:sz w:val="20"/>
+                <w:szCs w:val="20"/>
+              </w:rPr>
+              <w:t xml:space="preserve">30.7%</w:t>
+            </w:r>
+          </w:p>
+        </w:tc>
+        <w:tc>
+          <w:tcPr>
+            <w:tcW w:type="dxa" w:w="1960"/>
+            <w:vAlign w:val="center"/>
+          </w:tcPr>
+          <w:p>
+            <w:pPr>
+              <w:jc w:val="center"/>
+            </w:pPr>
+            <w:r>
+              <w:rPr>
+                <w:b w:val="false"/>
+                <w:bCs w:val="false"/>
+                <w:sz w:val="20"/>
+                <w:szCs w:val="20"/>
+              </w:rPr>
+              <w:t xml:space="preserve">static top-k</w:t>
+            </w:r>
+          </w:p>
+        </w:tc>
+      </w:tr>
+    </w:tbl>
+    <w:p>
+      <w:pPr>
+        <w:spacing w:after="240" w:before="80"/>
+        <w:jc w:val="center"/>
+      </w:pPr>
+      <w:r>
+        <w:rPr>
+          <w:i/>
+          <w:iCs/>
+          <w:sz w:val="20"/>
+          <w:szCs w:val="20"/>
+        </w:rPr>
+        <w:t xml:space="preserve">Table 7. Fully corrected head-to-head: AEWEE-NB vs. static top-k at matched compute budget, both using the leakage-free nested selection process. 2 wins for AEWEE-NB, 1 win for static top-k, 1 tie — the same qualitative mixed result as the pre-nested-CV version in an earlier revision, now on methodologically clean ground.</w:t>
+      </w:r>
+    </w:p>
+    <w:p>
+      <w:pPr>
+        <w:spacing w:after="160"/>
+        <w:jc w:val="both"/>
+      </w:pPr>
+      <w:r>
+        <w:t xml:space="preserve">The mechanism behind AEWEE-NB's wins on Wine and Digits remains the safety-aware selection process itself, not the adaptive-computation machinery: on Wine, the selection process correctly recognized it could not certify an aggressive configuration and fell back to a conservative one, whereas StaticTopKNB has no equivalent safety mechanism — it always uses whichever fixed k features it is given, with no way to hedge when the data does not support a confident choice. We would summarize the resulting method, more precisely than in earlier sections, as: an adaptive early-exit Gaussian Naive Bayes framework combining Fisher-based feature ordering, instance-dependent evidence evaluation, and confidence-based sequential early exit, paired with a data-adaptive hyperparameter selection procedure using nested cross-validation and a conservative, pessimistic accuracy-safety criterion. We do not claim this selection procedure makes τ or δ optimal in any formal sense — they remain ordinary hyperparameters, chosen by a more systematic empirical search than a hand-picked grid, not by a closed-form derivation.</w:t>
       </w:r>
     </w:p>
     <w:p>
@@ -4130,7 +5258,43 @@
         <w:spacing w:after="160" w:before="320"/>
       </w:pPr>
       <w:r>
-        <w:t xml:space="preserve">8. Limitations</w:t>
+        <w:t xml:space="preserve">8. Discussion</w:t>
+      </w:r>
+    </w:p>
+    <w:p>
+      <w:pPr>
+        <w:spacing w:after="160"/>
+        <w:jc w:val="both"/>
+      </w:pPr>
+      <w:r>
+        <w:t xml:space="preserve">Three findings stand out. First, the practical benefit of this method depends heavily on dataset structure: datasets with a clear, small set of highly discriminative features (Breast Cancer, Digits) see large, accuracy-preserving speedups (4–5×), while datasets with diffuse or redundant discriminative power (the synthetic benchmark) see much smaller gains. This is a useful, testable criterion for deciding whether the method is worth deploying on a new problem: compute the Fisher scores at training time and check whether they are concentrated in a small subset of features or spread nearly uniformly.</w:t>
+      </w:r>
+    </w:p>
+    <w:p>
+      <w:pPr>
+        <w:spacing w:after="160"/>
+        <w:jc w:val="both"/>
+      </w:pPr>
+      <w:r>
+        <w:t xml:space="preserve">Second, the ablation result in Section 5.5 changes how the method should be described and motivated. The original concept framed thresholding as a way to "skip" costly feature evaluations; our results show that, as implemented, thresholding cannot reduce cost on its own because computing the discriminative weight requires the same work as computing the contribution it might replace. The actual value of ordering and thresholding is in making early-exit accuracy-safe, not in avoiding computation directly. A genuinely cheaper pre-filter — for instance, a coarse, low-cost proxy for w_i(x) computed without evaluating the full Gaussian density — would be needed for thresholding to contribute independent savings, and is a natural direction for future work rather than something we can claim already works.</w:t>
+      </w:r>
+    </w:p>
+    <w:p>
+      <w:pPr>
+        <w:spacing w:after="160"/>
+        <w:jc w:val="both"/>
+      </w:pPr>
+      <w:r>
+        <w:t xml:space="preserve">Third, the wall-clock numbers in Table 2 should be read cautiously: our implementation is pure NumPy without low-level optimization, and both baseline and adaptive predict methods loop in Python per test sample, so absolute milliseconds are not representative of an optimized production implementation. The feature-evaluation count, not wall-clock time, is the accounting unit we treat as trustworthy, because it is implementation-independent and directly reflects the quantity the method is designed to reduce.</w:t>
+      </w:r>
+    </w:p>
+    <w:p>
+      <w:pPr>
+        <w:pStyle w:val="Heading1"/>
+        <w:spacing w:after="160" w:before="320"/>
+      </w:pPr>
+      <w:r>
+        <w:t xml:space="preserve">9. Limitations</w:t>
       </w:r>
     </w:p>
     <w:p>
@@ -4217,7 +5381,7 @@
         <w:spacing w:after="160" w:before="320"/>
       </w:pPr>
       <w:r>
-        <w:t xml:space="preserve">9. Future Work</w:t>
+        <w:t xml:space="preserve">10. Future Work</w:t>
       </w:r>
     </w:p>
     <w:p>
@@ -4291,7 +5455,7 @@
         <w:spacing w:after="160" w:before="320"/>
       </w:pPr>
       <w:r>
-        <w:t xml:space="preserve">10. Conclusion</w:t>
+        <w:t xml:space="preserve">11. Conclusion</w:t>
       </w:r>
     </w:p>
     <w:p>
@@ -4309,7 +5473,7 @@
         <w:jc w:val="both"/>
       </w:pPr>
       <w:r>
-        <w:t xml:space="preserve">The more important conclusion, however, comes from Section 6. At larger scale and against a fair, deliberately simple baseline — a fixed top-k feature subset chosen once at training time with no per-instance adaptivity — AEWEE-NB does not win. It matches the static baseline on some datasets and loses to it on others, including the high-dimensional sparse-signal setting that most resembles how Naive Bayes is actually deployed. We think this is worth publishing precisely because it is not the result the original concept expected: it shows that an intuitively appealing per-instance adaptive-computation scheme, once properly benchmarked against the simplest static alternative and pushed beyond toy-scale datasets, does not clearly earn its added complexity. Whether that changes with a genuinely cheap threshold pre-filter, a Multinomial-NB formulation suited to real text data, or a per-instance (rather than global) feature ordering remains open, and is the most promising direction for follow-up work.</w:t>
+        <w:t xml:space="preserve">Section 6's larger-scale comparison against a static top-k baseline initially looked like a clean loss for AEWEE-NB. Section 7 shows that conclusion was partly an artifact of two bugs in our own hyperparameter-selection process — a safety check that rewarded noisy candidates instead of penalizing them, and a fallback that silently chose the fastest untested option instead of the safest one. Fixing both changes the outcome from a uniform loss to a genuine mixed result: AEWEE-NB wins on two of four datasets, static top-k wins on one, and one is a tie. Importantly, the source of AEWEE-NB's wins is not the adaptive-computation machinery being inherently more efficient — it is the corrected selection process's ability to recognize when it cannot certify an aggressive configuration and fall back to a conservative one, a safety mechanism the static baseline has no equivalent of. We think both halves of this story are worth publishing together: the original negative-looking result, and the fact that a meaningful part of it traced back to bugs in our own evaluation code rather than a real limitation of the method. Whether the method's remaining advantage generalizes to a genuinely cheap threshold pre-filter, a Multinomial-NB formulation suited to real text data, or per-instance (rather than global) feature ordering remains open, and is the most promising direction for follow-up work.</w:t>
       </w:r>
     </w:p>
     <w:p>
@@ -4390,7 +5554,7 @@
         <w:jc w:val="both"/>
       </w:pPr>
       <w:r>
-        <w:t xml:space="preserve">The reference implementation (aewee_nb.py) and experiment harness (run_experiments.py, robustness_check.py) are available alongside this document. Both StandardGaussianNB and AdaptiveEvidenceWeightedEarlyExitNB are built from the same fit() routine structure (per-class mean/variance/prior with a shared variance-smoothing epsilon) so that any accuracy difference reflects the inference-time mechanism under test, not a difference in how the underlying distributions were estimated. The full ablation grid (τ ∈ {0, 0.05, 0.2, 0.5}, δ ∈ {2, 5, 10}, 4 variants, 4 datasets) and the 10-split robustness check are reproducible from these scripts.</w:t>
+        <w:t xml:space="preserve">The reference implementation (aewee_nb.py) and experiment harness (run_experiments.py, robustness_check.py, large_scale_experiments.py, nested_cv_experiment.py) are available alongside this document. Both StandardGaussianNB and AdaptiveEvidenceWeightedEarlyExitNB are built from the same fit() routine structure (per-class mean/variance/prior with a shared variance-smoothing epsilon) so that any accuracy difference reflects the inference-time mechanism under test, not a difference in how the underlying distributions were estimated. nested_cv_experiment.py implements the leakage-free selection procedure described in Section 7.4–7.5: for each outer cross-validation fold, the (τ, δ) candidate grid is generated strictly from that fold's inner-training data and evaluated on the untouched outer fold, with final concrete hyperparameter values computed from the full development set only after fold-wise selection is complete. The full ablation grid (τ ∈ {0, 0.05, 0.2, 0.5}, δ ∈ {2, 5, 10}, 4 variants, 4 datasets) and the 10-split robustness check are reproducible from these scripts.</w:t>
       </w:r>
     </w:p>
     <w:sectPr>

</xml_diff>